<commit_message>
inventory navigation and some new items
</commit_message>
<xml_diff>
--- a/farm/scenario ideas.docx
+++ b/farm/scenario ideas.docx
@@ -11,15 +11,7 @@
         </w:numPr>
       </w:pPr>
       <w:r>
-        <w:t xml:space="preserve">Make it so a stranger walks up and says heads or tails? Then you win one cent and buy a wheat seed with it and it’s how everything </w:t>
-      </w:r>
-      <w:proofErr w:type="spellStart"/>
-      <w:r>
-        <w:t>strats</w:t>
-      </w:r>
-      <w:proofErr w:type="spellEnd"/>
-      <w:r>
-        <w:t>.</w:t>
+        <w:t>Make it so a stranger walks up and says heads or tails? Then you win one cent and buy a wheat seed with it and it’s how everything strats.</w:t>
       </w:r>
     </w:p>
     <w:p>
@@ -31,47 +23,7 @@
         </w:numPr>
       </w:pPr>
       <w:r>
-        <w:t xml:space="preserve">At first you would bake bread on stones but it </w:t>
-      </w:r>
-      <w:proofErr w:type="spellStart"/>
-      <w:r>
-        <w:t>wpould</w:t>
-      </w:r>
-      <w:proofErr w:type="spellEnd"/>
-      <w:r>
-        <w:t xml:space="preserve"> depend on the weather(sun and rain) and it would </w:t>
-      </w:r>
-      <w:proofErr w:type="spellStart"/>
-      <w:r>
-        <w:t>tae</w:t>
-      </w:r>
-      <w:proofErr w:type="spellEnd"/>
-      <w:r>
-        <w:t xml:space="preserve"> a really </w:t>
-      </w:r>
-      <w:proofErr w:type="spellStart"/>
-      <w:r>
-        <w:t>lonbg</w:t>
-      </w:r>
-      <w:proofErr w:type="spellEnd"/>
-      <w:r>
-        <w:t xml:space="preserve"> time so you could upgrade to gas oven that you </w:t>
-      </w:r>
-      <w:proofErr w:type="spellStart"/>
-      <w:r>
-        <w:t>wold</w:t>
-      </w:r>
-      <w:proofErr w:type="spellEnd"/>
-      <w:r>
-        <w:t xml:space="preserve"> need to constantly fuel with gas you’d buy and(maybe) then upgrade to electric </w:t>
-      </w:r>
-      <w:proofErr w:type="spellStart"/>
-      <w:r>
-        <w:t>poven</w:t>
-      </w:r>
-      <w:proofErr w:type="spellEnd"/>
-      <w:r>
-        <w:t xml:space="preserve"> which will require a generator to work.</w:t>
+        <w:t>At first you would bake bread on stones but it wpould depend on the weather(sun and rain) and it would tae a really lonbg time so you could upgrade to gas oven that you wold need to constantly fuel with gas you’d buy and(maybe) then upgrade to electric poven which will require a generator to work.</w:t>
       </w:r>
     </w:p>
     <w:p>
@@ -103,64 +55,53 @@
           <w:b/>
           <w:bCs/>
         </w:rPr>
-        <w:t xml:space="preserve">Gas stove: 4 breads at a time costs a bit less if all 4 are cooking and much less if only one is cooking, cooks as fast as the furnace if only one stove is loaded getting slower if all </w:t>
+        <w:t>Gas stove: 4 breads at a time costs a bit less if all 4 are cooking and much less if only one is cooking, cooks as fast as the furnace if only one stove is loaded getting slower if all foure are cooking simoultyaneusly</w:t>
       </w:r>
-      <w:proofErr w:type="spellStart"/>
+    </w:p>
+    <w:p>
+      <w:pPr>
+        <w:pStyle w:val="ListParagraph"/>
+        <w:rPr>
+          <w:b/>
+          <w:bCs/>
+        </w:rPr>
+      </w:pPr>
       <w:r>
         <w:rPr>
           <w:b/>
           <w:bCs/>
         </w:rPr>
-        <w:t>foure</w:t>
+        <w:t xml:space="preserve">Electric oven: will not workl without a generator, but with it </w:t>
       </w:r>
-      <w:proofErr w:type="spellEnd"/>
       <w:r>
         <w:rPr>
           <w:b/>
           <w:bCs/>
         </w:rPr>
-        <w:t xml:space="preserve"> are cooking </w:t>
+        <w:t>does not need fuel</w:t>
       </w:r>
-      <w:proofErr w:type="spellStart"/>
       <w:r>
         <w:rPr>
           <w:b/>
           <w:bCs/>
         </w:rPr>
-        <w:t>simoultyaneusly</w:t>
+        <w:t xml:space="preserve"> nothing, can cook 2 bread at a time</w:t>
       </w:r>
-      <w:proofErr w:type="spellEnd"/>
     </w:p>
     <w:p>
       <w:pPr>
         <w:pStyle w:val="ListParagraph"/>
+        <w:numPr>
+          <w:ilvl w:val="0"/>
+          <w:numId w:val="1"/>
+        </w:numPr>
         <w:rPr>
           <w:b/>
           <w:bCs/>
         </w:rPr>
       </w:pPr>
       <w:r>
-        <w:rPr>
-          <w:b/>
-          <w:bCs/>
-        </w:rPr>
-        <w:t xml:space="preserve">Electric oven: will not </w:t>
-      </w:r>
-      <w:proofErr w:type="spellStart"/>
-      <w:r>
-        <w:rPr>
-          <w:b/>
-          <w:bCs/>
-        </w:rPr>
-        <w:t>workl</w:t>
-      </w:r>
-      <w:proofErr w:type="spellEnd"/>
-      <w:r>
-        <w:rPr>
-          <w:b/>
-          <w:bCs/>
-        </w:rPr>
-        <w:t xml:space="preserve"> without a generator, but with it costs nothing, can cook 2 bread at a time</w:t>
+        <w:t>Jack will say I gotta go and leave so he will leave you his truck and with it you can drive to the river. There you’ll find animals and you can breed them. And get everything you needed from jack.</w:t>
       </w:r>
     </w:p>
     <w:sectPr>
@@ -178,7 +119,7 @@
   <w:abstractNum w:abstractNumId="0" w15:restartNumberingAfterBreak="0">
     <w:nsid w:val="44A41AB9"/>
     <w:multiLevelType w:val="hybridMultilevel"/>
-    <w:tmpl w:val="A87C0826"/>
+    <w:tmpl w:val="F1781310"/>
     <w:lvl w:ilvl="0" w:tplc="04090001">
       <w:start w:val="1"/>
       <w:numFmt w:val="bullet"/>

</xml_diff>

<commit_message>
saving and loading game progress
</commit_message>
<xml_diff>
--- a/farm/scenario ideas.docx
+++ b/farm/scenario ideas.docx
@@ -102,6 +102,51 @@
       </w:pPr>
       <w:r>
         <w:t>Jack will say I gotta go and leave so he will leave you his truck and with it you can drive to the river. There you’ll find animals and you can breed them. And get everything you needed from jack.</w:t>
+      </w:r>
+    </w:p>
+    <w:p>
+      <w:pPr>
+        <w:rPr>
+          <w:b/>
+          <w:bCs/>
+        </w:rPr>
+      </w:pPr>
+    </w:p>
+    <w:p>
+      <w:pPr>
+        <w:rPr>
+          <w:rFonts w:ascii="Arial Black" w:hAnsi="Arial Black"/>
+          <w:sz w:val="56"/>
+          <w:szCs w:val="56"/>
+        </w:rPr>
+      </w:pPr>
+      <w:r>
+        <w:rPr>
+          <w:rFonts w:ascii="Arial Black" w:hAnsi="Arial Black"/>
+          <w:sz w:val="56"/>
+          <w:szCs w:val="56"/>
+        </w:rPr>
+        <w:t>What to add:</w:t>
+      </w:r>
+    </w:p>
+    <w:p>
+      <w:pPr>
+        <w:pStyle w:val="ListParagraph"/>
+        <w:numPr>
+          <w:ilvl w:val="0"/>
+          <w:numId w:val="1"/>
+        </w:numPr>
+        <w:rPr>
+          <w:rFonts w:ascii="Arial Black" w:hAnsi="Arial Black"/>
+          <w:sz w:val="56"/>
+          <w:szCs w:val="56"/>
+        </w:rPr>
+      </w:pPr>
+      <w:r>
+        <w:rPr>
+          <w:rFonts w:ascii="Arial Black" w:hAnsi="Arial Black"/>
+        </w:rPr>
+        <w:t>When scrolling the mouse wheel the selected item in inv should change but be on the same page. When doig that in sell panel the selected sellable should change.</w:t>
       </w:r>
     </w:p>
     <w:sectPr>
@@ -119,7 +164,7 @@
   <w:abstractNum w:abstractNumId="0" w15:restartNumberingAfterBreak="0">
     <w:nsid w:val="44A41AB9"/>
     <w:multiLevelType w:val="hybridMultilevel"/>
-    <w:tmpl w:val="F1781310"/>
+    <w:tmpl w:val="D3F02B34"/>
     <w:lvl w:ilvl="0" w:tplc="04090001">
       <w:start w:val="1"/>
       <w:numFmt w:val="bullet"/>

</xml_diff>

<commit_message>
auto descwription manager in item class
</commit_message>
<xml_diff>
--- a/farm/scenario ideas.docx
+++ b/farm/scenario ideas.docx
@@ -126,28 +126,355 @@
           <w:sz w:val="56"/>
           <w:szCs w:val="56"/>
         </w:rPr>
-        <w:t>What to add:</w:t>
-      </w:r>
-    </w:p>
-    <w:p>
-      <w:pPr>
-        <w:pStyle w:val="ListParagraph"/>
-        <w:numPr>
-          <w:ilvl w:val="0"/>
-          <w:numId w:val="1"/>
-        </w:numPr>
+        <w:t>What to add</w:t>
+      </w:r>
+      <w:r>
         <w:rPr>
           <w:rFonts w:ascii="Arial Black" w:hAnsi="Arial Black"/>
           <w:sz w:val="56"/>
           <w:szCs w:val="56"/>
         </w:rPr>
-      </w:pPr>
-      <w:r>
-        <w:rPr>
-          <w:rFonts w:ascii="Arial Black" w:hAnsi="Arial Black"/>
-        </w:rPr>
+        <w:t>/fix</w:t>
+      </w:r>
+      <w:r>
+        <w:rPr>
+          <w:rFonts w:ascii="Arial Black" w:hAnsi="Arial Black"/>
+          <w:sz w:val="56"/>
+          <w:szCs w:val="56"/>
+        </w:rPr>
+        <w:t>:</w:t>
+      </w:r>
+    </w:p>
+    <w:p>
+      <w:pPr>
+        <w:pStyle w:val="NormalWeb"/>
+        <w:numPr>
+          <w:ilvl w:val="0"/>
+          <w:numId w:val="1"/>
+        </w:numPr>
+        <w:rPr>
+          <w:rFonts w:ascii="Arial Black" w:hAnsi="Arial Black"/>
+          <w:sz w:val="22"/>
+          <w:szCs w:val="22"/>
+        </w:rPr>
+      </w:pPr>
+      <w:r>
+        <w:rPr>
+          <w:rFonts w:ascii="Arial Black" w:hAnsi="Arial Black"/>
+          <w:sz w:val="22"/>
+          <w:szCs w:val="22"/>
+        </w:rPr>
+        <w:t xml:space="preserve">Add descriptions like what does a bucket actually do </w:t>
+      </w:r>
+    </w:p>
+    <w:p>
+      <w:pPr>
+        <w:pStyle w:val="NormalWeb"/>
+        <w:numPr>
+          <w:ilvl w:val="0"/>
+          <w:numId w:val="1"/>
+        </w:numPr>
+        <w:rPr>
+          <w:rFonts w:ascii="Arial Black" w:hAnsi="Arial Black"/>
+          <w:sz w:val="22"/>
+          <w:szCs w:val="22"/>
+        </w:rPr>
+      </w:pPr>
+      <w:r>
+        <w:rPr>
+          <w:rFonts w:ascii="Arial Black" w:hAnsi="Arial Black"/>
+          <w:sz w:val="22"/>
+          <w:szCs w:val="22"/>
+        </w:rPr>
+        <w:t xml:space="preserve">Add pop up messages like you don't have enough money to buy this </w:t>
+      </w:r>
+    </w:p>
+    <w:p>
+      <w:pPr>
+        <w:pStyle w:val="NormalWeb"/>
+        <w:numPr>
+          <w:ilvl w:val="0"/>
+          <w:numId w:val="1"/>
+        </w:numPr>
+        <w:rPr>
+          <w:rFonts w:ascii="Arial Black" w:hAnsi="Arial Black"/>
+          <w:sz w:val="22"/>
+          <w:szCs w:val="22"/>
+        </w:rPr>
+      </w:pPr>
+      <w:r>
+        <w:rPr>
+          <w:rFonts w:ascii="Arial Black" w:hAnsi="Arial Black"/>
+          <w:sz w:val="22"/>
+          <w:szCs w:val="22"/>
+        </w:rPr>
+        <w:t xml:space="preserve">In sell panel you need to always select something that is selected in hot bar if hot bar selection changes but you are still able to select something in sell panel selection. </w:t>
+      </w:r>
+    </w:p>
+    <w:p>
+      <w:pPr>
+        <w:pStyle w:val="NormalWeb"/>
+        <w:numPr>
+          <w:ilvl w:val="0"/>
+          <w:numId w:val="1"/>
+        </w:numPr>
+        <w:rPr>
+          <w:rFonts w:ascii="Arial Black" w:hAnsi="Arial Black"/>
+          <w:sz w:val="22"/>
+          <w:szCs w:val="22"/>
+        </w:rPr>
+      </w:pPr>
+      <w:r>
+        <w:rPr>
+          <w:rFonts w:ascii="Arial Black" w:hAnsi="Arial Black"/>
+          <w:sz w:val="22"/>
+          <w:szCs w:val="22"/>
+        </w:rPr>
+        <w:t xml:space="preserve">Improve descriptions. </w:t>
+      </w:r>
+    </w:p>
+    <w:p>
+      <w:pPr>
+        <w:pStyle w:val="NormalWeb"/>
+        <w:numPr>
+          <w:ilvl w:val="0"/>
+          <w:numId w:val="1"/>
+        </w:numPr>
+        <w:rPr>
+          <w:rFonts w:ascii="Arial Black" w:hAnsi="Arial Black"/>
+          <w:sz w:val="22"/>
+          <w:szCs w:val="22"/>
+        </w:rPr>
+      </w:pPr>
+      <w:r>
+        <w:rPr>
+          <w:rFonts w:ascii="Arial Black" w:hAnsi="Arial Black"/>
+          <w:sz w:val="22"/>
+          <w:szCs w:val="22"/>
+        </w:rPr>
+        <w:t xml:space="preserve">Sell custom does not remove item from inv if you sell all items. It leaves it as wheat bundle x0. </w:t>
+      </w:r>
+    </w:p>
+    <w:p>
+      <w:pPr>
+        <w:pStyle w:val="NormalWeb"/>
+        <w:numPr>
+          <w:ilvl w:val="0"/>
+          <w:numId w:val="1"/>
+        </w:numPr>
+        <w:rPr>
+          <w:rFonts w:ascii="Arial Black" w:hAnsi="Arial Black"/>
+          <w:sz w:val="22"/>
+          <w:szCs w:val="22"/>
+        </w:rPr>
+      </w:pPr>
+      <w:r>
+        <w:rPr>
+          <w:rFonts w:ascii="Arial Black" w:hAnsi="Arial Black"/>
+          <w:sz w:val="22"/>
+          <w:szCs w:val="22"/>
+        </w:rPr>
+        <w:t xml:space="preserve">Add fertilizer properties to item descriptions. For example: oven decreases multipliers around it. </w:t>
+      </w:r>
+    </w:p>
+    <w:p>
+      <w:pPr>
+        <w:pStyle w:val="NormalWeb"/>
+        <w:numPr>
+          <w:ilvl w:val="0"/>
+          <w:numId w:val="1"/>
+        </w:numPr>
+        <w:rPr>
+          <w:rFonts w:ascii="Arial Black" w:hAnsi="Arial Black"/>
+          <w:sz w:val="22"/>
+          <w:szCs w:val="22"/>
+        </w:rPr>
+      </w:pPr>
+      <w:r>
+        <w:rPr>
+          <w:rFonts w:ascii="Arial Black" w:hAnsi="Arial Black"/>
+          <w:sz w:val="22"/>
+          <w:szCs w:val="22"/>
+        </w:rPr>
+        <w:t xml:space="preserve">When hovered over fertilized field display with which fertilizers it is fertilized and it's multiplier and the time left for play to grow and all that other shit. </w:t>
+      </w:r>
+    </w:p>
+    <w:p>
+      <w:pPr>
+        <w:pStyle w:val="NormalWeb"/>
+        <w:numPr>
+          <w:ilvl w:val="0"/>
+          <w:numId w:val="1"/>
+        </w:numPr>
+        <w:rPr>
+          <w:rFonts w:ascii="Arial Black" w:hAnsi="Arial Black"/>
+          <w:sz w:val="22"/>
+          <w:szCs w:val="22"/>
+        </w:rPr>
+      </w:pPr>
+      <w:r>
+        <w:rPr>
+          <w:rFonts w:ascii="Arial Black" w:hAnsi="Arial Black"/>
+          <w:sz w:val="22"/>
+          <w:szCs w:val="22"/>
+        </w:rPr>
+        <w:t xml:space="preserve">Millstone time should be 35 secs BUT ONLY WHEN YOU ADD THE WIND MILL. </w:t>
+      </w:r>
+    </w:p>
+    <w:p>
+      <w:pPr>
+        <w:pStyle w:val="NormalWeb"/>
+        <w:numPr>
+          <w:ilvl w:val="0"/>
+          <w:numId w:val="1"/>
+        </w:numPr>
+        <w:rPr>
+          <w:rFonts w:ascii="Arial Black" w:hAnsi="Arial Black"/>
+          <w:sz w:val="22"/>
+          <w:szCs w:val="22"/>
+        </w:rPr>
+      </w:pPr>
+      <w:r>
+        <w:rPr>
+          <w:rFonts w:ascii="Arial Black" w:hAnsi="Arial Black"/>
+          <w:sz w:val="22"/>
+          <w:szCs w:val="22"/>
+        </w:rPr>
+        <w:t xml:space="preserve">Bowl price is too low make it 175 or some shit like that. </w:t>
+      </w:r>
+    </w:p>
+    <w:p>
+      <w:pPr>
+        <w:pStyle w:val="NormalWeb"/>
+        <w:numPr>
+          <w:ilvl w:val="0"/>
+          <w:numId w:val="1"/>
+        </w:numPr>
+        <w:rPr>
+          <w:rFonts w:ascii="Arial Black" w:hAnsi="Arial Black"/>
+          <w:sz w:val="22"/>
+          <w:szCs w:val="22"/>
+        </w:rPr>
+      </w:pPr>
+      <w:r>
+        <w:rPr>
+          <w:rFonts w:ascii="Arial Black" w:hAnsi="Arial Black"/>
+          <w:sz w:val="22"/>
+          <w:szCs w:val="22"/>
+        </w:rPr>
+        <w:t xml:space="preserve">Dough sell price should be 35 and bread should be 50. </w:t>
+      </w:r>
+    </w:p>
+    <w:p>
+      <w:pPr>
+        <w:pStyle w:val="NormalWeb"/>
+        <w:numPr>
+          <w:ilvl w:val="0"/>
+          <w:numId w:val="1"/>
+        </w:numPr>
+        <w:rPr>
+          <w:rFonts w:ascii="Arial Black" w:hAnsi="Arial Black"/>
+          <w:sz w:val="22"/>
+          <w:szCs w:val="22"/>
+        </w:rPr>
+      </w:pPr>
+      <w:r>
+        <w:rPr>
+          <w:rFonts w:ascii="Arial Black" w:hAnsi="Arial Black"/>
+          <w:sz w:val="22"/>
+          <w:szCs w:val="22"/>
+        </w:rPr>
+        <w:t xml:space="preserve">Flour should be sold for 15 </w:t>
+      </w:r>
+    </w:p>
+    <w:p>
+      <w:pPr>
+        <w:pStyle w:val="NormalWeb"/>
+        <w:numPr>
+          <w:ilvl w:val="0"/>
+          <w:numId w:val="1"/>
+        </w:numPr>
+        <w:rPr>
+          <w:rFonts w:ascii="Arial Black" w:hAnsi="Arial Black"/>
+          <w:sz w:val="22"/>
+          <w:szCs w:val="22"/>
+        </w:rPr>
+      </w:pPr>
+      <w:r>
+        <w:rPr>
+          <w:rFonts w:ascii="Arial Black" w:hAnsi="Arial Black"/>
+          <w:sz w:val="22"/>
+          <w:szCs w:val="22"/>
+        </w:rPr>
+        <w:t xml:space="preserve">Wood should cost 20 </w:t>
+      </w:r>
+    </w:p>
+    <w:p>
+      <w:pPr>
+        <w:pStyle w:val="NormalWeb"/>
+        <w:numPr>
+          <w:ilvl w:val="0"/>
+          <w:numId w:val="1"/>
+        </w:numPr>
+        <w:rPr>
+          <w:rFonts w:ascii="Arial Black" w:hAnsi="Arial Black"/>
+          <w:sz w:val="22"/>
+          <w:szCs w:val="22"/>
+        </w:rPr>
+      </w:pPr>
+      <w:r>
+        <w:rPr>
+          <w:rFonts w:ascii="Arial Black" w:hAnsi="Arial Black"/>
+          <w:sz w:val="22"/>
+          <w:szCs w:val="22"/>
+        </w:rPr>
+        <w:t>Name ideas: grow up!, grow it up!("It" should be really small.)</w:t>
+      </w:r>
+    </w:p>
+    <w:p>
+      <w:pPr>
+        <w:pStyle w:val="ListParagraph"/>
+        <w:numPr>
+          <w:ilvl w:val="0"/>
+          <w:numId w:val="1"/>
+        </w:numPr>
+        <w:rPr>
+          <w:rFonts w:ascii="Arial Black" w:hAnsi="Arial Black"/>
+          <w:sz w:val="56"/>
+          <w:szCs w:val="56"/>
+        </w:rPr>
+      </w:pPr>
+      <w:r>
+        <w:rPr>
+          <w:rFonts w:ascii="Arial Black" w:hAnsi="Arial Black"/>
+        </w:rPr>
+        <w:lastRenderedPageBreak/>
         <w:t>When scrolling the mouse wheel the selected item in inv should change but be on the same page. When doig that in sell panel the selected sellable should change.</w:t>
       </w:r>
+    </w:p>
+    <w:p>
+      <w:pPr>
+        <w:pStyle w:val="NormalWeb"/>
+        <w:numPr>
+          <w:ilvl w:val="0"/>
+          <w:numId w:val="1"/>
+        </w:numPr>
+        <w:rPr>
+          <w:rFonts w:ascii="Arial Black" w:hAnsi="Arial Black"/>
+          <w:sz w:val="22"/>
+          <w:szCs w:val="22"/>
+        </w:rPr>
+      </w:pPr>
+    </w:p>
+    <w:p>
+      <w:pPr>
+        <w:pStyle w:val="ListParagraph"/>
+        <w:rPr>
+          <w:rFonts w:ascii="Arial Black" w:hAnsi="Arial Black"/>
+          <w:sz w:val="56"/>
+          <w:szCs w:val="56"/>
+        </w:rPr>
+      </w:pPr>
     </w:p>
     <w:sectPr>
       <w:pgSz w:w="12240" w:h="15840"/>
@@ -164,14 +491,14 @@
   <w:abstractNum w:abstractNumId="0" w15:restartNumberingAfterBreak="0">
     <w:nsid w:val="44A41AB9"/>
     <w:multiLevelType w:val="hybridMultilevel"/>
-    <w:tmpl w:val="D3F02B34"/>
+    <w:tmpl w:val="697883C8"/>
     <w:lvl w:ilvl="0" w:tplc="04090001">
       <w:start w:val="1"/>
       <w:numFmt w:val="bullet"/>
       <w:lvlText w:val=""/>
       <w:lvlJc w:val="left"/>
       <w:pPr>
-        <w:ind w:left="720" w:hanging="360"/>
+        <w:ind w:left="900" w:hanging="360"/>
       </w:pPr>
       <w:rPr>
         <w:rFonts w:ascii="Symbol" w:hAnsi="Symbol" w:hint="default"/>
@@ -717,6 +1044,21 @@
       <w:contextualSpacing/>
     </w:pPr>
   </w:style>
+  <w:style w:type="paragraph" w:styleId="NormalWeb">
+    <w:name w:val="Normal (Web)"/>
+    <w:basedOn w:val="Normal"/>
+    <w:uiPriority w:val="99"/>
+    <w:unhideWhenUsed/>
+    <w:rsid w:val="004C50E2"/>
+    <w:pPr>
+      <w:spacing w:before="100" w:beforeAutospacing="1" w:after="100" w:afterAutospacing="1" w:line="240" w:lineRule="auto"/>
+    </w:pPr>
+    <w:rPr>
+      <w:rFonts w:ascii="Times New Roman" w:eastAsia="Times New Roman" w:hAnsi="Times New Roman" w:cs="Times New Roman"/>
+      <w:sz w:val="24"/>
+      <w:szCs w:val="24"/>
+    </w:rPr>
+  </w:style>
 </w:styles>
 </file>
 

</xml_diff>

<commit_message>
button dimming(enabling and disabling
</commit_message>
<xml_diff>
--- a/farm/scenario ideas.docx
+++ b/farm/scenario ideas.docx
@@ -11,15 +11,7 @@
         </w:numPr>
       </w:pPr>
       <w:r>
-        <w:t xml:space="preserve">Make it so a </w:t>
-      </w:r>
-      <w:proofErr w:type="gramStart"/>
-      <w:r>
-        <w:t>stranger walks</w:t>
-      </w:r>
-      <w:proofErr w:type="gramEnd"/>
-      <w:r>
-        <w:t xml:space="preserve"> up and says heads or tails? Then you win one cent and buy a wheat seed with it and it’s how everything </w:t>
+        <w:t xml:space="preserve">Make it so a stranger walks up and says heads or tails? Then you win one cent and buy a wheat seed with it and it’s how everything </w:t>
       </w:r>
       <w:proofErr w:type="spellStart"/>
       <w:r>
@@ -47,15 +39,7 @@
       </w:r>
       <w:proofErr w:type="spellEnd"/>
       <w:r>
-        <w:t xml:space="preserve"> depend on the </w:t>
-      </w:r>
-      <w:proofErr w:type="gramStart"/>
-      <w:r>
-        <w:t>weather(</w:t>
-      </w:r>
-      <w:proofErr w:type="gramEnd"/>
-      <w:r>
-        <w:t xml:space="preserve">sun and rain) and it would </w:t>
+        <w:t xml:space="preserve"> depend on the weather(sun and rain) and it would </w:t>
       </w:r>
       <w:proofErr w:type="spellStart"/>
       <w:r>
@@ -190,23 +174,7 @@
           <w:b/>
           <w:bCs/>
         </w:rPr>
-        <w:t xml:space="preserve"> nothing, can cook 2 </w:t>
-      </w:r>
-      <w:proofErr w:type="gramStart"/>
-      <w:r>
-        <w:rPr>
-          <w:b/>
-          <w:bCs/>
-        </w:rPr>
-        <w:t>bread</w:t>
-      </w:r>
-      <w:proofErr w:type="gramEnd"/>
-      <w:r>
-        <w:rPr>
-          <w:b/>
-          <w:bCs/>
-        </w:rPr>
-        <w:t xml:space="preserve"> at a time</w:t>
+        <w:t xml:space="preserve"> nothing, can cook 2 bread at a time</w:t>
       </w:r>
     </w:p>
     <w:p>
@@ -293,19 +261,8 @@
           <w:sz w:val="22"/>
           <w:szCs w:val="22"/>
         </w:rPr>
-        <w:t xml:space="preserve">Add descriptions like what does a bucket actually do </w:t>
-      </w:r>
-      <w:proofErr w:type="gramStart"/>
-      <w:r>
-        <w:rPr>
-          <w:rFonts w:ascii="Arial Black" w:hAnsi="Arial Black"/>
-          <w:color w:val="385623" w:themeColor="accent6" w:themeShade="80"/>
-          <w:sz w:val="22"/>
-          <w:szCs w:val="22"/>
-        </w:rPr>
-        <w:t>done</w:t>
-      </w:r>
-      <w:proofErr w:type="gramEnd"/>
+        <w:t xml:space="preserve">Add pop up messages like you don't have enough money to buy this </w:t>
+      </w:r>
     </w:p>
     <w:p>
       <w:pPr>
@@ -326,7 +283,7 @@
           <w:sz w:val="22"/>
           <w:szCs w:val="22"/>
         </w:rPr>
-        <w:t xml:space="preserve">Add pop up messages like you don't have enough money to buy this </w:t>
+        <w:t xml:space="preserve">When hovered over fertilized field display with which fertilizers it is fertilized and it's multiplier and the time left for play to grow and all that other shit. </w:t>
       </w:r>
     </w:p>
     <w:p>
@@ -348,16 +305,7 @@
           <w:sz w:val="22"/>
           <w:szCs w:val="22"/>
         </w:rPr>
-        <w:t xml:space="preserve">In sell panel you need to always select something that is selected in hot bar if hot bar selection changes but you are still able to select something in sell panel selection. </w:t>
-      </w:r>
-      <w:r>
-        <w:rPr>
-          <w:rFonts w:ascii="Arial Black" w:hAnsi="Arial Black"/>
-          <w:color w:val="385623" w:themeColor="accent6" w:themeShade="80"/>
-          <w:sz w:val="22"/>
-          <w:szCs w:val="22"/>
-        </w:rPr>
-        <w:t>done</w:t>
+        <w:t xml:space="preserve">Millstone time should be 35 secs BUT ONLY WHEN YOU ADD THE WIND MILL. </w:t>
       </w:r>
     </w:p>
     <w:p>
@@ -379,7 +327,15 @@
           <w:sz w:val="22"/>
           <w:szCs w:val="22"/>
         </w:rPr>
-        <w:t xml:space="preserve">Improve descriptions. </w:t>
+        <w:t>Game n</w:t>
+      </w:r>
+      <w:r>
+        <w:rPr>
+          <w:rFonts w:ascii="Arial Black" w:hAnsi="Arial Black"/>
+          <w:sz w:val="22"/>
+          <w:szCs w:val="22"/>
+        </w:rPr>
+        <w:t>ame ideas: grow up!, grow it up!("It" should be really small.)</w:t>
       </w:r>
     </w:p>
     <w:p>
@@ -401,7 +357,7 @@
           <w:sz w:val="22"/>
           <w:szCs w:val="22"/>
         </w:rPr>
-        <w:t xml:space="preserve">Sell custom does not remove item from inv if you sell all items. It leaves it as wheat bundle x0. </w:t>
+        <w:t>Achievements</w:t>
       </w:r>
     </w:p>
     <w:p>
@@ -423,7 +379,7 @@
           <w:sz w:val="22"/>
           <w:szCs w:val="22"/>
         </w:rPr>
-        <w:t xml:space="preserve">Add fertilizer properties to item descriptions. For example: oven decreases multipliers around it. </w:t>
+        <w:t>Darken the sell buttons if the item selected is not sellable ort you don’t have it and the buy buttons if it’s not buyable.</w:t>
       </w:r>
     </w:p>
     <w:p>
@@ -445,25 +401,7 @@
           <w:sz w:val="22"/>
           <w:szCs w:val="22"/>
         </w:rPr>
-        <w:t xml:space="preserve">When hovered over fertilized field display with which fertilizers it is fertilized and </w:t>
-      </w:r>
-      <w:proofErr w:type="gramStart"/>
-      <w:r>
-        <w:rPr>
-          <w:rFonts w:ascii="Arial Black" w:hAnsi="Arial Black"/>
-          <w:sz w:val="22"/>
-          <w:szCs w:val="22"/>
-        </w:rPr>
-        <w:t>it's</w:t>
-      </w:r>
-      <w:proofErr w:type="gramEnd"/>
-      <w:r>
-        <w:rPr>
-          <w:rFonts w:ascii="Arial Black" w:hAnsi="Arial Black"/>
-          <w:sz w:val="22"/>
-          <w:szCs w:val="22"/>
-        </w:rPr>
-        <w:t xml:space="preserve"> multiplier and the time left for play to grow and all that other shit. </w:t>
+        <w:t>Add settings.</w:t>
       </w:r>
     </w:p>
     <w:p>
@@ -485,234 +423,8 @@
           <w:sz w:val="22"/>
           <w:szCs w:val="22"/>
         </w:rPr>
-        <w:t xml:space="preserve">Millstone time should be 35 secs BUT ONLY WHEN YOU ADD THE WIND MILL. </w:t>
-      </w:r>
-    </w:p>
-    <w:p>
-      <w:pPr>
-        <w:pStyle w:val="NormalWeb"/>
-        <w:numPr>
-          <w:ilvl w:val="0"/>
-          <w:numId w:val="1"/>
-        </w:numPr>
-        <w:rPr>
-          <w:rFonts w:ascii="Arial Black" w:hAnsi="Arial Black"/>
-          <w:sz w:val="22"/>
-          <w:szCs w:val="22"/>
-        </w:rPr>
-      </w:pPr>
-      <w:r>
-        <w:rPr>
-          <w:rFonts w:ascii="Arial Black" w:hAnsi="Arial Black"/>
-          <w:sz w:val="22"/>
-          <w:szCs w:val="22"/>
-        </w:rPr>
-        <w:t xml:space="preserve">Bowl price is too low make it 175 or some shit like that. </w:t>
-      </w:r>
-    </w:p>
-    <w:p>
-      <w:pPr>
-        <w:pStyle w:val="NormalWeb"/>
-        <w:numPr>
-          <w:ilvl w:val="0"/>
-          <w:numId w:val="1"/>
-        </w:numPr>
-        <w:rPr>
-          <w:rFonts w:ascii="Arial Black" w:hAnsi="Arial Black"/>
-          <w:sz w:val="22"/>
-          <w:szCs w:val="22"/>
-        </w:rPr>
-      </w:pPr>
-      <w:r>
-        <w:rPr>
-          <w:rFonts w:ascii="Arial Black" w:hAnsi="Arial Black"/>
-          <w:sz w:val="22"/>
-          <w:szCs w:val="22"/>
-        </w:rPr>
-        <w:t xml:space="preserve">Dough sell price should be 35 and bread should be 50. </w:t>
-      </w:r>
-    </w:p>
-    <w:p>
-      <w:pPr>
-        <w:pStyle w:val="NormalWeb"/>
-        <w:numPr>
-          <w:ilvl w:val="0"/>
-          <w:numId w:val="1"/>
-        </w:numPr>
-        <w:rPr>
-          <w:rFonts w:ascii="Arial Black" w:hAnsi="Arial Black"/>
-          <w:sz w:val="22"/>
-          <w:szCs w:val="22"/>
-        </w:rPr>
-      </w:pPr>
-      <w:r>
-        <w:rPr>
-          <w:rFonts w:ascii="Arial Black" w:hAnsi="Arial Black"/>
-          <w:sz w:val="22"/>
-          <w:szCs w:val="22"/>
-        </w:rPr>
-        <w:t xml:space="preserve">Flour should be sold for 15 </w:t>
-      </w:r>
-    </w:p>
-    <w:p>
-      <w:pPr>
-        <w:pStyle w:val="NormalWeb"/>
-        <w:numPr>
-          <w:ilvl w:val="0"/>
-          <w:numId w:val="1"/>
-        </w:numPr>
-        <w:rPr>
-          <w:rFonts w:ascii="Arial Black" w:hAnsi="Arial Black"/>
-          <w:sz w:val="22"/>
-          <w:szCs w:val="22"/>
-        </w:rPr>
-      </w:pPr>
-      <w:r>
-        <w:rPr>
-          <w:rFonts w:ascii="Arial Black" w:hAnsi="Arial Black"/>
-          <w:sz w:val="22"/>
-          <w:szCs w:val="22"/>
-        </w:rPr>
-        <w:t xml:space="preserve">Wood should cost 20 </w:t>
-      </w:r>
-    </w:p>
-    <w:p>
-      <w:pPr>
-        <w:pStyle w:val="NormalWeb"/>
-        <w:numPr>
-          <w:ilvl w:val="0"/>
-          <w:numId w:val="1"/>
-        </w:numPr>
-        <w:rPr>
-          <w:rFonts w:ascii="Arial Black" w:hAnsi="Arial Black"/>
-          <w:sz w:val="22"/>
-          <w:szCs w:val="22"/>
-        </w:rPr>
-      </w:pPr>
-      <w:r>
-        <w:rPr>
-          <w:rFonts w:ascii="Arial Black" w:hAnsi="Arial Black"/>
-          <w:sz w:val="22"/>
-          <w:szCs w:val="22"/>
-        </w:rPr>
-        <w:t xml:space="preserve">Name ideas: grow </w:t>
-      </w:r>
-      <w:proofErr w:type="gramStart"/>
-      <w:r>
-        <w:rPr>
-          <w:rFonts w:ascii="Arial Black" w:hAnsi="Arial Black"/>
-          <w:sz w:val="22"/>
-          <w:szCs w:val="22"/>
-        </w:rPr>
-        <w:t>up!,</w:t>
-      </w:r>
-      <w:proofErr w:type="gramEnd"/>
-      <w:r>
-        <w:rPr>
-          <w:rFonts w:ascii="Arial Black" w:hAnsi="Arial Black"/>
-          <w:sz w:val="22"/>
-          <w:szCs w:val="22"/>
-        </w:rPr>
-        <w:t xml:space="preserve"> grow it up!("It" should be really small.)</w:t>
-      </w:r>
-    </w:p>
-    <w:p>
-      <w:pPr>
-        <w:pStyle w:val="NormalWeb"/>
-        <w:numPr>
-          <w:ilvl w:val="0"/>
-          <w:numId w:val="1"/>
-        </w:numPr>
-        <w:rPr>
-          <w:rFonts w:ascii="Arial Black" w:hAnsi="Arial Black"/>
-          <w:sz w:val="22"/>
-          <w:szCs w:val="22"/>
-        </w:rPr>
-      </w:pPr>
-      <w:r>
-        <w:rPr>
-          <w:rFonts w:ascii="Arial Black" w:hAnsi="Arial Black"/>
-          <w:sz w:val="22"/>
-          <w:szCs w:val="22"/>
-        </w:rPr>
-        <w:t>Display the inv page.</w:t>
-      </w:r>
-    </w:p>
-    <w:p>
-      <w:pPr>
-        <w:pStyle w:val="ListParagraph"/>
-        <w:numPr>
-          <w:ilvl w:val="0"/>
-          <w:numId w:val="1"/>
-        </w:numPr>
-        <w:rPr>
-          <w:rFonts w:ascii="Arial Black" w:hAnsi="Arial Black"/>
-          <w:sz w:val="56"/>
-          <w:szCs w:val="56"/>
-        </w:rPr>
-      </w:pPr>
-      <w:r>
-        <w:rPr>
-          <w:rFonts w:ascii="Arial Black" w:hAnsi="Arial Black"/>
-        </w:rPr>
-        <w:lastRenderedPageBreak/>
-        <w:t xml:space="preserve">When scrolling the mouse </w:t>
-      </w:r>
-      <w:proofErr w:type="gramStart"/>
-      <w:r>
-        <w:rPr>
-          <w:rFonts w:ascii="Arial Black" w:hAnsi="Arial Black"/>
-        </w:rPr>
-        <w:t>wheel</w:t>
-      </w:r>
-      <w:proofErr w:type="gramEnd"/>
-      <w:r>
-        <w:rPr>
-          <w:rFonts w:ascii="Arial Black" w:hAnsi="Arial Black"/>
-        </w:rPr>
-        <w:t xml:space="preserve"> the selected item in inv should change but be on the same page. When </w:t>
-      </w:r>
-      <w:proofErr w:type="spellStart"/>
-      <w:r>
-        <w:rPr>
-          <w:rFonts w:ascii="Arial Black" w:hAnsi="Arial Black"/>
-        </w:rPr>
-        <w:t>doig</w:t>
-      </w:r>
-      <w:proofErr w:type="spellEnd"/>
-      <w:r>
-        <w:rPr>
-          <w:rFonts w:ascii="Arial Black" w:hAnsi="Arial Black"/>
-        </w:rPr>
-        <w:t xml:space="preserve"> that in sell panel the selected sellable should change.</w:t>
-      </w:r>
-      <w:r>
-        <w:rPr>
-          <w:rFonts w:ascii="Arial Black" w:hAnsi="Arial Black"/>
-        </w:rPr>
-        <w:t xml:space="preserve"> </w:t>
-      </w:r>
-      <w:r>
-        <w:rPr>
-          <w:rFonts w:ascii="Arial Black" w:hAnsi="Arial Black"/>
-          <w:color w:val="385623" w:themeColor="accent6" w:themeShade="80"/>
-        </w:rPr>
-        <w:t>done</w:t>
-      </w:r>
-    </w:p>
-    <w:p>
-      <w:pPr>
-        <w:pStyle w:val="NormalWeb"/>
-        <w:numPr>
-          <w:ilvl w:val="0"/>
-          <w:numId w:val="1"/>
-        </w:numPr>
-        <w:rPr>
-          <w:rFonts w:ascii="Arial Black" w:hAnsi="Arial Black"/>
-          <w:sz w:val="22"/>
-          <w:szCs w:val="22"/>
-        </w:rPr>
-      </w:pPr>
+        <w:t>More tile variants (about 10-12 in total)</w:t>
+      </w:r>
     </w:p>
     <w:p>
       <w:pPr>

</xml_diff>

<commit_message>
info badges on machines and fields + checkmark is shown when something is complete
</commit_message>
<xml_diff>
--- a/farm/scenario ideas.docx
+++ b/farm/scenario ideas.docx
@@ -11,7 +11,23 @@
         </w:numPr>
       </w:pPr>
       <w:r>
-        <w:t>Make it so a stranger walks up and says heads or tails? Then you win one cent and buy a wheat seed with it and it’s how everything strats.</w:t>
+        <w:t xml:space="preserve">Make it so a </w:t>
+      </w:r>
+      <w:proofErr w:type="gramStart"/>
+      <w:r>
+        <w:t>stranger walks</w:t>
+      </w:r>
+      <w:proofErr w:type="gramEnd"/>
+      <w:r>
+        <w:t xml:space="preserve"> up and says heads or tails? Then you win one cent and buy a wheat seed with it and it’s how everything </w:t>
+      </w:r>
+      <w:proofErr w:type="spellStart"/>
+      <w:r>
+        <w:t>strats</w:t>
+      </w:r>
+      <w:proofErr w:type="spellEnd"/>
+      <w:r>
+        <w:t>.</w:t>
       </w:r>
     </w:p>
     <w:p>
@@ -23,7 +39,55 @@
         </w:numPr>
       </w:pPr>
       <w:r>
-        <w:t>At first you would bake bread on stones but it wpould depend on the weather(sun and rain) and it would tae a really lonbg time so you could upgrade to gas oven that you wold need to constantly fuel with gas you’d buy and(maybe) then upgrade to electric poven which will require a generator to work.</w:t>
+        <w:t xml:space="preserve">At first you would bake bread on stones but it </w:t>
+      </w:r>
+      <w:proofErr w:type="spellStart"/>
+      <w:r>
+        <w:t>wpould</w:t>
+      </w:r>
+      <w:proofErr w:type="spellEnd"/>
+      <w:r>
+        <w:t xml:space="preserve"> depend on the </w:t>
+      </w:r>
+      <w:proofErr w:type="gramStart"/>
+      <w:r>
+        <w:t>weather(</w:t>
+      </w:r>
+      <w:proofErr w:type="gramEnd"/>
+      <w:r>
+        <w:t xml:space="preserve">sun and rain) and it would </w:t>
+      </w:r>
+      <w:proofErr w:type="spellStart"/>
+      <w:r>
+        <w:t>tae</w:t>
+      </w:r>
+      <w:proofErr w:type="spellEnd"/>
+      <w:r>
+        <w:t xml:space="preserve"> a really </w:t>
+      </w:r>
+      <w:proofErr w:type="spellStart"/>
+      <w:r>
+        <w:t>lonbg</w:t>
+      </w:r>
+      <w:proofErr w:type="spellEnd"/>
+      <w:r>
+        <w:t xml:space="preserve"> time so you could upgrade to gas oven that you </w:t>
+      </w:r>
+      <w:proofErr w:type="spellStart"/>
+      <w:r>
+        <w:t>wold</w:t>
+      </w:r>
+      <w:proofErr w:type="spellEnd"/>
+      <w:r>
+        <w:t xml:space="preserve"> need to constantly fuel with gas you’d buy and(maybe) then upgrade to electric </w:t>
+      </w:r>
+      <w:proofErr w:type="spellStart"/>
+      <w:r>
+        <w:t>poven</w:t>
+      </w:r>
+      <w:proofErr w:type="spellEnd"/>
+      <w:r>
+        <w:t xml:space="preserve"> which will require a generator to work.</w:t>
       </w:r>
     </w:p>
     <w:p>
@@ -55,8 +119,33 @@
           <w:b/>
           <w:bCs/>
         </w:rPr>
-        <w:t>Gas stove: 4 breads at a time costs a bit less if all 4 are cooking and much less if only one is cooking, cooks as fast as the furnace if only one stove is loaded getting slower if all foure are cooking simoultyaneusly</w:t>
-      </w:r>
+        <w:t xml:space="preserve">Gas stove: 4 breads at a time costs a bit less if all 4 are cooking and much less if only one is cooking, cooks as fast as the furnace if only one stove is loaded getting slower if all </w:t>
+      </w:r>
+      <w:proofErr w:type="spellStart"/>
+      <w:r>
+        <w:rPr>
+          <w:b/>
+          <w:bCs/>
+        </w:rPr>
+        <w:t>foure</w:t>
+      </w:r>
+      <w:proofErr w:type="spellEnd"/>
+      <w:r>
+        <w:rPr>
+          <w:b/>
+          <w:bCs/>
+        </w:rPr>
+        <w:t xml:space="preserve"> are cooking </w:t>
+      </w:r>
+      <w:proofErr w:type="spellStart"/>
+      <w:r>
+        <w:rPr>
+          <w:b/>
+          <w:bCs/>
+        </w:rPr>
+        <w:t>simoultyaneusly</w:t>
+      </w:r>
+      <w:proofErr w:type="spellEnd"/>
     </w:p>
     <w:p>
       <w:pPr>
@@ -71,7 +160,23 @@
           <w:b/>
           <w:bCs/>
         </w:rPr>
-        <w:t xml:space="preserve">Electric oven: will not workl without a generator, but with it </w:t>
+        <w:t xml:space="preserve">Electric oven: will not </w:t>
+      </w:r>
+      <w:proofErr w:type="spellStart"/>
+      <w:r>
+        <w:rPr>
+          <w:b/>
+          <w:bCs/>
+        </w:rPr>
+        <w:t>workl</w:t>
+      </w:r>
+      <w:proofErr w:type="spellEnd"/>
+      <w:r>
+        <w:rPr>
+          <w:b/>
+          <w:bCs/>
+        </w:rPr>
+        <w:t xml:space="preserve"> without a generator, but with it </w:t>
       </w:r>
       <w:r>
         <w:rPr>
@@ -85,7 +190,23 @@
           <w:b/>
           <w:bCs/>
         </w:rPr>
-        <w:t xml:space="preserve"> nothing, can cook 2 bread at a time</w:t>
+        <w:t xml:space="preserve"> nothing, can cook 2 </w:t>
+      </w:r>
+      <w:proofErr w:type="gramStart"/>
+      <w:r>
+        <w:rPr>
+          <w:b/>
+          <w:bCs/>
+        </w:rPr>
+        <w:t>bread</w:t>
+      </w:r>
+      <w:proofErr w:type="gramEnd"/>
+      <w:r>
+        <w:rPr>
+          <w:b/>
+          <w:bCs/>
+        </w:rPr>
+        <w:t xml:space="preserve"> at a time</w:t>
       </w:r>
     </w:p>
     <w:p>
@@ -101,7 +222,15 @@
         </w:rPr>
       </w:pPr>
       <w:r>
-        <w:t>Jack will say I gotta go and leave so he will leave you his truck and with it you can drive to the river. There you’ll find animals and you can breed them. And get everything you needed from jack.</w:t>
+        <w:t xml:space="preserve">Jack will say I </w:t>
+      </w:r>
+      <w:proofErr w:type="spellStart"/>
+      <w:r>
+        <w:t>gotta</w:t>
+      </w:r>
+      <w:proofErr w:type="spellEnd"/>
+      <w:r>
+        <w:t xml:space="preserve"> go and leave so he will leave you his truck and with it you can drive to the river. There you’ll find animals and you can breed them. And get everything you needed from jack.</w:t>
       </w:r>
     </w:p>
     <w:p>
@@ -236,7 +365,25 @@
           <w:sz w:val="22"/>
           <w:szCs w:val="22"/>
         </w:rPr>
-        <w:t>ame ideas: grow up!, grow it up!("It" should be really small.)</w:t>
+        <w:t xml:space="preserve">ame ideas: grow </w:t>
+      </w:r>
+      <w:proofErr w:type="gramStart"/>
+      <w:r>
+        <w:rPr>
+          <w:rFonts w:ascii="Arial Black" w:hAnsi="Arial Black"/>
+          <w:sz w:val="22"/>
+          <w:szCs w:val="22"/>
+        </w:rPr>
+        <w:t>up!,</w:t>
+      </w:r>
+      <w:proofErr w:type="gramEnd"/>
+      <w:r>
+        <w:rPr>
+          <w:rFonts w:ascii="Arial Black" w:hAnsi="Arial Black"/>
+          <w:sz w:val="22"/>
+          <w:szCs w:val="22"/>
+        </w:rPr>
+        <w:t xml:space="preserve"> grow it up!("It" should be really small.)</w:t>
       </w:r>
     </w:p>
     <w:p>
@@ -260,7 +407,7 @@
           <w:sz w:val="22"/>
           <w:szCs w:val="22"/>
         </w:rPr>
-        <w:t>Achievements</w:t>
+        <w:t>Make info badges only appear when you hover over object for a long time or if you middle-mouse-click it.</w:t>
       </w:r>
     </w:p>
     <w:p>
@@ -284,7 +431,7 @@
           <w:sz w:val="22"/>
           <w:szCs w:val="22"/>
         </w:rPr>
-        <w:t>Add settings.</w:t>
+        <w:t>Achievements</w:t>
       </w:r>
     </w:p>
     <w:p>
@@ -296,17 +443,19 @@
         </w:numPr>
         <w:rPr>
           <w:rFonts w:ascii="Arial Black" w:hAnsi="Arial Black"/>
-          <w:sz w:val="22"/>
-          <w:szCs w:val="22"/>
-        </w:rPr>
-      </w:pPr>
-      <w:r>
-        <w:rPr>
-          <w:rFonts w:ascii="Arial Black" w:hAnsi="Arial Black"/>
-          <w:sz w:val="22"/>
-          <w:szCs w:val="22"/>
-        </w:rPr>
-        <w:t>Make it so you can arrange items in inventory how you want</w:t>
+          <w:color w:val="FF0000"/>
+          <w:sz w:val="22"/>
+          <w:szCs w:val="22"/>
+        </w:rPr>
+      </w:pPr>
+      <w:r>
+        <w:rPr>
+          <w:rFonts w:ascii="Arial Black" w:hAnsi="Arial Black"/>
+          <w:color w:val="FF0000"/>
+          <w:sz w:val="22"/>
+          <w:szCs w:val="22"/>
+        </w:rPr>
+        <w:t>Add settings.</w:t>
       </w:r>
     </w:p>
     <w:p>
@@ -328,7 +477,7 @@
           <w:sz w:val="22"/>
           <w:szCs w:val="22"/>
         </w:rPr>
-        <w:t>Unlocks (similar to secrets in Isaac)</w:t>
+        <w:t>Make it so you can arrange items in inventory how you want</w:t>
       </w:r>
     </w:p>
     <w:p>
@@ -350,7 +499,47 @@
           <w:sz w:val="22"/>
           <w:szCs w:val="22"/>
         </w:rPr>
-        <w:t>After the wheat shit you’ll have the honey and bees shit.</w:t>
+        <w:t>Unlocks (similar to secrets in Isaac)</w:t>
+      </w:r>
+    </w:p>
+    <w:p>
+      <w:pPr>
+        <w:pStyle w:val="NormalWeb"/>
+        <w:numPr>
+          <w:ilvl w:val="0"/>
+          <w:numId w:val="1"/>
+        </w:numPr>
+        <w:rPr>
+          <w:rFonts w:ascii="Arial Black" w:hAnsi="Arial Black"/>
+          <w:sz w:val="22"/>
+          <w:szCs w:val="22"/>
+        </w:rPr>
+      </w:pPr>
+      <w:r>
+        <w:rPr>
+          <w:rFonts w:ascii="Arial Black" w:hAnsi="Arial Black"/>
+          <w:sz w:val="22"/>
+          <w:szCs w:val="22"/>
+        </w:rPr>
+        <w:t xml:space="preserve">After the wheat </w:t>
+      </w:r>
+      <w:proofErr w:type="gramStart"/>
+      <w:r>
+        <w:rPr>
+          <w:rFonts w:ascii="Arial Black" w:hAnsi="Arial Black"/>
+          <w:sz w:val="22"/>
+          <w:szCs w:val="22"/>
+        </w:rPr>
+        <w:t>shit</w:t>
+      </w:r>
+      <w:proofErr w:type="gramEnd"/>
+      <w:r>
+        <w:rPr>
+          <w:rFonts w:ascii="Arial Black" w:hAnsi="Arial Black"/>
+          <w:sz w:val="22"/>
+          <w:szCs w:val="22"/>
+        </w:rPr>
+        <w:t xml:space="preserve"> you’ll have the honey and bees shit.</w:t>
       </w:r>
     </w:p>
     <w:p>
@@ -434,7 +623,6 @@
           <w:sz w:val="56"/>
           <w:szCs w:val="56"/>
         </w:rPr>
-        <w:lastRenderedPageBreak/>
         <w:t>MARKETING:</w:t>
       </w:r>
     </w:p>
@@ -459,8 +647,9 @@
           <w:sz w:val="28"/>
           <w:szCs w:val="28"/>
         </w:rPr>
-        <w:t>When you upload it on steam make the price 5$</w:t>
-      </w:r>
+        <w:t xml:space="preserve">When you upload it on steam make the price </w:t>
+      </w:r>
+      <w:proofErr w:type="gramStart"/>
       <w:r>
         <w:rPr>
           <w:rFonts w:ascii="Arial Black" w:hAnsi="Arial Black"/>
@@ -468,8 +657,18 @@
           <w:sz w:val="28"/>
           <w:szCs w:val="28"/>
         </w:rPr>
+        <w:t>5$</w:t>
+      </w:r>
+      <w:r>
+        <w:rPr>
+          <w:rFonts w:ascii="Arial Black" w:hAnsi="Arial Black"/>
+          <w:color w:val="1F3864" w:themeColor="accent1" w:themeShade="80"/>
+          <w:sz w:val="28"/>
+          <w:szCs w:val="28"/>
+        </w:rPr>
         <w:t>.</w:t>
       </w:r>
+      <w:proofErr w:type="gramEnd"/>
     </w:p>
     <w:p>
       <w:pPr>
@@ -551,7 +750,67 @@
           <w:sz w:val="28"/>
           <w:szCs w:val="28"/>
         </w:rPr>
-        <w:t>Major: t t p t t t p</w:t>
+        <w:t xml:space="preserve">Major: t </w:t>
+      </w:r>
+      <w:proofErr w:type="spellStart"/>
+      <w:r>
+        <w:rPr>
+          <w:rFonts w:ascii="Arial Black" w:hAnsi="Arial Black"/>
+          <w:color w:val="806000" w:themeColor="accent4" w:themeShade="80"/>
+          <w:sz w:val="28"/>
+          <w:szCs w:val="28"/>
+        </w:rPr>
+        <w:t>t</w:t>
+      </w:r>
+      <w:proofErr w:type="spellEnd"/>
+      <w:r>
+        <w:rPr>
+          <w:rFonts w:ascii="Arial Black" w:hAnsi="Arial Black"/>
+          <w:color w:val="806000" w:themeColor="accent4" w:themeShade="80"/>
+          <w:sz w:val="28"/>
+          <w:szCs w:val="28"/>
+        </w:rPr>
+        <w:t xml:space="preserve"> p t </w:t>
+      </w:r>
+      <w:proofErr w:type="spellStart"/>
+      <w:r>
+        <w:rPr>
+          <w:rFonts w:ascii="Arial Black" w:hAnsi="Arial Black"/>
+          <w:color w:val="806000" w:themeColor="accent4" w:themeShade="80"/>
+          <w:sz w:val="28"/>
+          <w:szCs w:val="28"/>
+        </w:rPr>
+        <w:t>t</w:t>
+      </w:r>
+      <w:proofErr w:type="spellEnd"/>
+      <w:r>
+        <w:rPr>
+          <w:rFonts w:ascii="Arial Black" w:hAnsi="Arial Black"/>
+          <w:color w:val="806000" w:themeColor="accent4" w:themeShade="80"/>
+          <w:sz w:val="28"/>
+          <w:szCs w:val="28"/>
+        </w:rPr>
+        <w:t xml:space="preserve"> </w:t>
+      </w:r>
+      <w:proofErr w:type="spellStart"/>
+      <w:r>
+        <w:rPr>
+          <w:rFonts w:ascii="Arial Black" w:hAnsi="Arial Black"/>
+          <w:color w:val="806000" w:themeColor="accent4" w:themeShade="80"/>
+          <w:sz w:val="28"/>
+          <w:szCs w:val="28"/>
+        </w:rPr>
+        <w:t>t</w:t>
+      </w:r>
+      <w:proofErr w:type="spellEnd"/>
+      <w:r>
+        <w:rPr>
+          <w:rFonts w:ascii="Arial Black" w:hAnsi="Arial Black"/>
+          <w:color w:val="806000" w:themeColor="accent4" w:themeShade="80"/>
+          <w:sz w:val="28"/>
+          <w:szCs w:val="28"/>
+        </w:rPr>
+        <w:t xml:space="preserve"> p</w:t>
       </w:r>
     </w:p>
     <w:p>
@@ -575,8 +834,39 @@
           <w:sz w:val="28"/>
           <w:szCs w:val="28"/>
         </w:rPr>
-        <w:t>Minor: t p t t p t t</w:t>
-      </w:r>
+        <w:t xml:space="preserve">Minor: t p t </w:t>
+      </w:r>
+      <w:proofErr w:type="spellStart"/>
+      <w:r>
+        <w:rPr>
+          <w:rFonts w:ascii="Arial Black" w:hAnsi="Arial Black"/>
+          <w:color w:val="806000" w:themeColor="accent4" w:themeShade="80"/>
+          <w:sz w:val="28"/>
+          <w:szCs w:val="28"/>
+        </w:rPr>
+        <w:t>t</w:t>
+      </w:r>
+      <w:proofErr w:type="spellEnd"/>
+      <w:r>
+        <w:rPr>
+          <w:rFonts w:ascii="Arial Black" w:hAnsi="Arial Black"/>
+          <w:color w:val="806000" w:themeColor="accent4" w:themeShade="80"/>
+          <w:sz w:val="28"/>
+          <w:szCs w:val="28"/>
+        </w:rPr>
+        <w:t xml:space="preserve"> p t </w:t>
+      </w:r>
+      <w:proofErr w:type="spellStart"/>
+      <w:r>
+        <w:rPr>
+          <w:rFonts w:ascii="Arial Black" w:hAnsi="Arial Black"/>
+          <w:color w:val="806000" w:themeColor="accent4" w:themeShade="80"/>
+          <w:sz w:val="28"/>
+          <w:szCs w:val="28"/>
+        </w:rPr>
+        <w:t>t</w:t>
+      </w:r>
+      <w:proofErr w:type="spellEnd"/>
     </w:p>
     <w:sectPr>
       <w:pgSz w:w="12240" w:h="15840"/>

</xml_diff>